<commit_message>
T8: the guides link the live demo site and SECURITY.md
- User Guide: the quick start points to the published reports on GitHub Pages.
- Administrator Guide: the documentation table lists SECURITY.md and CHANGELOG.md, the security chapter says how to
  report a vulnerability, and the CI section names the demonstration site and what gates its deployment.
- PDFs and Word documents rebuilt. Every screenshot regenerates byte-identically with the merged
  tools/make_screenshots.py.

Co-Authored-By: Claude Opus 5.5 <noreply@anthropic.com>
</commit_message>
<xml_diff>
--- a/docs/guide/inspection-reconcile-admin-guide.docx
+++ b/docs/guide/inspection-reconcile-admin-guide.docx
@@ -60,7 +60,7 @@
         </w:p>
       </w:sdtContent>
     </w:sdt>
-    <w:bookmarkStart w:id="17" w:name="about-this-guide"/>
+    <w:bookmarkStart w:id="19" w:name="about-this-guide"/>
     <w:p>
       <w:pPr>
         <w:pStyle w:val="Heading1"/>
@@ -157,7 +157,7 @@
       </w:r>
     </w:p>
     <w:bookmarkEnd w:id="10"/>
-    <w:bookmarkStart w:id="16" w:name="where-the-details-live"/>
+    <w:bookmarkStart w:id="18" w:name="where-the-details-live"/>
     <w:p>
       <w:pPr>
         <w:pStyle w:val="Heading2"/>
@@ -357,6 +357,64 @@
           </w:p>
         </w:tc>
       </w:tr>
+      <w:tr>
+        <w:tc>
+          <w:tcPr/>
+          <w:p>
+            <w:pPr>
+              <w:pStyle w:val="Compact"/>
+            </w:pPr>
+            <w:hyperlink r:id="rId16">
+              <w:r>
+                <w:rPr>
+                  <w:rStyle w:val="Hyperlink"/>
+                </w:rPr>
+                <w:t xml:space="preserve">SECURITY.md</w:t>
+              </w:r>
+            </w:hyperlink>
+          </w:p>
+        </w:tc>
+        <w:tc>
+          <w:tcPr/>
+          <w:p>
+            <w:pPr>
+              <w:pStyle w:val="Compact"/>
+            </w:pPr>
+            <w:r>
+              <w:t xml:space="preserve">how to report a vulnerability privately</w:t>
+            </w:r>
+          </w:p>
+        </w:tc>
+      </w:tr>
+      <w:tr>
+        <w:tc>
+          <w:tcPr/>
+          <w:p>
+            <w:pPr>
+              <w:pStyle w:val="Compact"/>
+            </w:pPr>
+            <w:hyperlink r:id="rId17">
+              <w:r>
+                <w:rPr>
+                  <w:rStyle w:val="Hyperlink"/>
+                </w:rPr>
+                <w:t xml:space="preserve">CHANGELOG.md</w:t>
+              </w:r>
+            </w:hyperlink>
+          </w:p>
+        </w:tc>
+        <w:tc>
+          <w:tcPr/>
+          <w:p>
+            <w:pPr>
+              <w:pStyle w:val="Compact"/>
+            </w:pPr>
+            <w:r>
+              <w:t xml:space="preserve">what changed in each release</w:t>
+            </w:r>
+          </w:p>
+        </w:tc>
+      </w:tr>
     </w:tbl>
     <w:p>
       <w:pPr>
@@ -382,9 +440,9 @@
         <w:t xml:space="preserve">Quickbase, Inc.; this project is not affiliated with or endorsed by Quickbase.</w:t>
       </w:r>
     </w:p>
-    <w:bookmarkEnd w:id="16"/>
-    <w:bookmarkEnd w:id="17"/>
-    <w:bookmarkStart w:id="24" w:name="architecture"/>
+    <w:bookmarkEnd w:id="18"/>
+    <w:bookmarkEnd w:id="19"/>
+    <w:bookmarkStart w:id="26" w:name="architecture"/>
     <w:p>
       <w:pPr>
         <w:pStyle w:val="Heading1"/>
@@ -402,7 +460,7 @@
         <w:t xml:space="preserve">Architecture</w:t>
       </w:r>
     </w:p>
-    <w:bookmarkStart w:id="21" w:name="the-pipeline"/>
+    <w:bookmarkStart w:id="23" w:name="the-pipeline"/>
     <w:p>
       <w:pPr>
         <w:pStyle w:val="Heading2"/>
@@ -429,18 +487,18 @@
           <wp:inline>
             <wp:extent cx="5334000" cy="4667250"/>
             <wp:effectExtent b="0" l="0" r="0" t="0"/>
-            <wp:docPr descr="How data flows: a Quickbase app or any other system produces a canonical snapshot; the engine assesses it against a requirement pack" title="" id="19" name="Picture"/>
+            <wp:docPr descr="How data flows: a Quickbase app or any other system produces a canonical snapshot; the engine assesses it against a requirement pack" title="" id="21" name="Picture"/>
             <a:graphic>
               <a:graphicData uri="http://schemas.openxmlformats.org/drawingml/2006/picture">
                 <pic:pic>
                   <pic:nvPicPr>
-                    <pic:cNvPr descr="rasterized/architecture.png" id="20" name="Picture"/>
+                    <pic:cNvPr descr="rasterized/architecture.png" id="22" name="Picture"/>
                     <pic:cNvPicPr>
                       <a:picLocks noChangeArrowheads="1" noChangeAspect="1"/>
                     </pic:cNvPicPr>
                   </pic:nvPicPr>
                   <pic:blipFill>
-                    <a:blip r:embed="rId18"/>
+                    <a:blip r:embed="rId20"/>
                     <a:stretch>
                       <a:fillRect/>
                     </a:stretch>
@@ -679,8 +737,8 @@
         <w:t xml:space="preserve">on every operating system.</w:t>
       </w:r>
     </w:p>
-    <w:bookmarkEnd w:id="21"/>
-    <w:bookmarkStart w:id="22" w:name="repository-layout"/>
+    <w:bookmarkEnd w:id="23"/>
+    <w:bookmarkStart w:id="24" w:name="repository-layout"/>
     <w:p>
       <w:pPr>
         <w:pStyle w:val="Heading2"/>
@@ -1081,8 +1139,8 @@
         </w:tc>
       </w:tr>
     </w:tbl>
-    <w:bookmarkEnd w:id="22"/>
-    <w:bookmarkStart w:id="23" w:name="design-principles"/>
+    <w:bookmarkEnd w:id="24"/>
+    <w:bookmarkStart w:id="25" w:name="design-principles"/>
     <w:p>
       <w:pPr>
         <w:pStyle w:val="Heading2"/>
@@ -1237,9 +1295,9 @@
         <w:t xml:space="preserve">folder.</w:t>
       </w:r>
     </w:p>
-    <w:bookmarkEnd w:id="23"/>
-    <w:bookmarkEnd w:id="24"/>
-    <w:bookmarkStart w:id="31" w:name="installation"/>
+    <w:bookmarkEnd w:id="25"/>
+    <w:bookmarkEnd w:id="26"/>
+    <w:bookmarkStart w:id="33" w:name="installation"/>
     <w:p>
       <w:pPr>
         <w:pStyle w:val="Heading1"/>
@@ -1257,7 +1315,7 @@
         <w:t xml:space="preserve">Installation</w:t>
       </w:r>
     </w:p>
-    <w:bookmarkStart w:id="26" w:name="requirements"/>
+    <w:bookmarkStart w:id="28" w:name="requirements"/>
     <w:p>
       <w:pPr>
         <w:pStyle w:val="Heading2"/>
@@ -1366,7 +1424,7 @@
             <w:pPr>
               <w:pStyle w:val="Compact"/>
             </w:pPr>
-            <w:hyperlink r:id="rId25">
+            <w:hyperlink r:id="rId27">
               <w:r>
                 <w:rPr>
                   <w:rStyle w:val="Hyperlink"/>
@@ -1484,8 +1542,8 @@
         <w:t xml:space="preserve">checks that every platform produces identical identities and report digests.</w:t>
       </w:r>
     </w:p>
-    <w:bookmarkEnd w:id="26"/>
-    <w:bookmarkStart w:id="27" w:name="windows"/>
+    <w:bookmarkEnd w:id="28"/>
+    <w:bookmarkStart w:id="29" w:name="windows"/>
     <w:p>
       <w:pPr>
         <w:pStyle w:val="Heading2"/>
@@ -1669,8 +1727,8 @@
         <w:t xml:space="preserve">uv sync</w:t>
       </w:r>
     </w:p>
-    <w:bookmarkEnd w:id="27"/>
-    <w:bookmarkStart w:id="28" w:name="macos-and-linux"/>
+    <w:bookmarkEnd w:id="29"/>
+    <w:bookmarkStart w:id="30" w:name="macos-and-linux"/>
     <w:p>
       <w:pPr>
         <w:pStyle w:val="Heading2"/>
@@ -1812,8 +1870,8 @@
         <w:t xml:space="preserve">.</w:t>
       </w:r>
     </w:p>
-    <w:bookmarkEnd w:id="28"/>
-    <w:bookmarkStart w:id="29" w:name="optional-components"/>
+    <w:bookmarkEnd w:id="30"/>
+    <w:bookmarkStart w:id="31" w:name="optional-components"/>
     <w:p>
       <w:pPr>
         <w:pStyle w:val="Heading2"/>
@@ -2007,8 +2065,8 @@
         </w:tc>
       </w:tr>
     </w:tbl>
-    <w:bookmarkEnd w:id="29"/>
-    <w:bookmarkStart w:id="30" w:name="verify-the-installation"/>
+    <w:bookmarkEnd w:id="31"/>
+    <w:bookmarkStart w:id="32" w:name="verify-the-installation"/>
     <w:p>
       <w:pPr>
         <w:pStyle w:val="Heading2"/>
@@ -2203,9 +2261,9 @@
         <w:t xml:space="preserve"> run mypy</w:t>
       </w:r>
     </w:p>
-    <w:bookmarkEnd w:id="30"/>
-    <w:bookmarkEnd w:id="31"/>
-    <w:bookmarkStart w:id="39" w:name="the-requirement-pack"/>
+    <w:bookmarkEnd w:id="32"/>
+    <w:bookmarkEnd w:id="33"/>
+    <w:bookmarkStart w:id="41" w:name="the-requirement-pack"/>
     <w:p>
       <w:pPr>
         <w:pStyle w:val="Heading1"/>
@@ -2223,7 +2281,7 @@
         <w:t xml:space="preserve">The requirement pack</w:t>
       </w:r>
     </w:p>
-    <w:bookmarkStart w:id="32" w:name="format"/>
+    <w:bookmarkStart w:id="34" w:name="format"/>
     <w:p>
       <w:pPr>
         <w:pStyle w:val="Heading2"/>
@@ -3700,8 +3758,8 @@
         <w:t xml:space="preserve">}</w:t>
       </w:r>
     </w:p>
-    <w:bookmarkEnd w:id="32"/>
-    <w:bookmarkStart w:id="33" w:name="field-by-field"/>
+    <w:bookmarkEnd w:id="34"/>
+    <w:bookmarkStart w:id="35" w:name="field-by-field"/>
     <w:p>
       <w:pPr>
         <w:pStyle w:val="Heading2"/>
@@ -4359,8 +4417,8 @@
         <w:t xml:space="preserve">Every member is required, and an unknown member at any level is a run error.</w:t>
       </w:r>
     </w:p>
-    <w:bookmarkEnd w:id="33"/>
-    <w:bookmarkStart w:id="34" w:name="versioning-and-effective_from"/>
+    <w:bookmarkEnd w:id="35"/>
+    <w:bookmarkStart w:id="36" w:name="versioning-and-effective_from"/>
     <w:p>
       <w:pPr>
         <w:pStyle w:val="Heading2"/>
@@ -4467,8 +4525,8 @@
         <w:t xml:space="preserve">computed over the parsed content, so comments and formatting do not change it.</w:t>
       </w:r>
     </w:p>
-    <w:bookmarkEnd w:id="34"/>
-    <w:bookmarkStart w:id="35" w:name="accepted-coverage-bases"/>
+    <w:bookmarkEnd w:id="36"/>
+    <w:bookmarkStart w:id="37" w:name="accepted-coverage-bases"/>
     <w:p>
       <w:pPr>
         <w:pStyle w:val="Heading2"/>
@@ -4676,8 +4734,8 @@
         <w:t xml:space="preserve">failures. Do it only deliberately, and record why.</w:t>
       </w:r>
     </w:p>
-    <w:bookmarkEnd w:id="35"/>
-    <w:bookmarkStart w:id="36" w:name="approval-binding-digest-or-revisions"/>
+    <w:bookmarkEnd w:id="37"/>
+    <w:bookmarkStart w:id="38" w:name="approval-binding-digest-or-revisions"/>
     <w:p>
       <w:pPr>
         <w:pStyle w:val="Heading2"/>
@@ -4807,8 +4865,8 @@
         <w:t xml:space="preserve">command prints the digest a review process should store with its decision.</w:t>
       </w:r>
     </w:p>
-    <w:bookmarkEnd w:id="36"/>
-    <w:bookmarkStart w:id="37" w:name="safe-yaml"/>
+    <w:bookmarkEnd w:id="38"/>
+    <w:bookmarkStart w:id="39" w:name="safe-yaml"/>
     <w:p>
       <w:pPr>
         <w:pStyle w:val="Heading2"/>
@@ -4939,8 +4997,8 @@
         <w:t xml:space="preserve">expecting an integer rejects them instead of silently reading another number.</w:t>
       </w:r>
     </w:p>
-    <w:bookmarkEnd w:id="37"/>
-    <w:bookmarkStart w:id="38" w:name="writing-a-pack-for-a-real-project"/>
+    <w:bookmarkEnd w:id="39"/>
+    <w:bookmarkStart w:id="40" w:name="writing-a-pack-for-a-real-project"/>
     <w:p>
       <w:pPr>
         <w:pStyle w:val="Heading2"/>
@@ -4978,9 +5036,9 @@
         <w:t xml:space="preserve">requirements. Application configuration cannot establish business intent.</w:t>
       </w:r>
     </w:p>
-    <w:bookmarkEnd w:id="38"/>
-    <w:bookmarkEnd w:id="39"/>
-    <w:bookmarkStart w:id="47" w:name="the-canonical-snapshot"/>
+    <w:bookmarkEnd w:id="40"/>
+    <w:bookmarkEnd w:id="41"/>
+    <w:bookmarkStart w:id="49" w:name="the-canonical-snapshot"/>
     <w:p>
       <w:pPr>
         <w:pStyle w:val="Heading1"/>
@@ -5021,7 +5079,7 @@
         <w:t xml:space="preserve">write it.</w:t>
       </w:r>
     </w:p>
-    <w:bookmarkStart w:id="40" w:name="directory-layout"/>
+    <w:bookmarkStart w:id="42" w:name="directory-layout"/>
     <w:p>
       <w:pPr>
         <w:pStyle w:val="Heading2"/>
@@ -5154,8 +5212,8 @@
         <w:t xml:space="preserve">). The evidence root must be a real folder, not a link or junction.</w:t>
       </w:r>
     </w:p>
-    <w:bookmarkEnd w:id="40"/>
-    <w:bookmarkStart w:id="41" w:name="manifestjson"/>
+    <w:bookmarkEnd w:id="42"/>
+    <w:bookmarkStart w:id="43" w:name="manifestjson"/>
     <w:p>
       <w:pPr>
         <w:pStyle w:val="Heading2"/>
@@ -7169,8 +7227,8 @@
         </w:tc>
       </w:tr>
     </w:tbl>
-    <w:bookmarkEnd w:id="41"/>
-    <w:bookmarkStart w:id="42" w:name="projectjson"/>
+    <w:bookmarkEnd w:id="43"/>
+    <w:bookmarkStart w:id="44" w:name="projectjson"/>
     <w:p>
       <w:pPr>
         <w:pStyle w:val="Heading2"/>
@@ -7360,8 +7418,8 @@
         <w:t xml:space="preserve">must equal the pack's.</w:t>
       </w:r>
     </w:p>
-    <w:bookmarkEnd w:id="42"/>
-    <w:bookmarkStart w:id="43" w:name="csv-rules"/>
+    <w:bookmarkEnd w:id="44"/>
+    <w:bookmarkStart w:id="45" w:name="csv-rules"/>
     <w:p>
       <w:pPr>
         <w:pStyle w:val="Heading2"/>
@@ -7554,8 +7612,8 @@
         <w:t xml:space="preserve">.</w:t>
       </w:r>
     </w:p>
-    <w:bookmarkEnd w:id="43"/>
-    <w:bookmarkStart w:id="44" w:name="columns"/>
+    <w:bookmarkEnd w:id="45"/>
+    <w:bookmarkStart w:id="46" w:name="columns"/>
     <w:p>
       <w:pPr>
         <w:pStyle w:val="Heading2"/>
@@ -9353,8 +9411,8 @@
         <w:t xml:space="preserve">that the approval covers one artifact revision.</w:t>
       </w:r>
     </w:p>
-    <w:bookmarkEnd w:id="44"/>
-    <w:bookmarkStart w:id="45" w:name="value-grammars"/>
+    <w:bookmarkEnd w:id="46"/>
+    <w:bookmarkStart w:id="47" w:name="value-grammars"/>
     <w:p>
       <w:pPr>
         <w:pStyle w:val="Heading2"/>
@@ -9811,8 +9869,8 @@
         <w:t xml:space="preserve">quarantined. A path that breaks the PATH rules is never opened.</w:t>
       </w:r>
     </w:p>
-    <w:bookmarkEnd w:id="45"/>
-    <w:bookmarkStart w:id="46" w:name="coverage-claims-and-basis-tokens"/>
+    <w:bookmarkEnd w:id="47"/>
+    <w:bookmarkStart w:id="48" w:name="coverage-claims-and-basis-tokens"/>
     <w:p>
       <w:pPr>
         <w:pStyle w:val="Heading2"/>
@@ -10128,9 +10186,9 @@
         <w:t xml:space="preserve">one the dataset does not contain.</w:t>
       </w:r>
     </w:p>
-    <w:bookmarkEnd w:id="46"/>
-    <w:bookmarkEnd w:id="47"/>
-    <w:bookmarkStart w:id="56" w:name="quickbase"/>
+    <w:bookmarkEnd w:id="48"/>
+    <w:bookmarkEnd w:id="49"/>
+    <w:bookmarkStart w:id="58" w:name="quickbase"/>
     <w:p>
       <w:pPr>
         <w:pStyle w:val="Heading1"/>
@@ -10148,7 +10206,7 @@
         <w:t xml:space="preserve">Quickbase</w:t>
       </w:r>
     </w:p>
-    <w:bookmarkStart w:id="48" w:name="what-the-adapter-does"/>
+    <w:bookmarkStart w:id="50" w:name="what-the-adapter-does"/>
     <w:p>
       <w:pPr>
         <w:pStyle w:val="Heading2"/>
@@ -10327,8 +10385,8 @@
         <w:t xml:space="preserve">.</w:t>
       </w:r>
     </w:p>
-    <w:bookmarkEnd w:id="48"/>
-    <w:bookmarkStart w:id="49" w:name="the-field-mapping"/>
+    <w:bookmarkEnd w:id="50"/>
+    <w:bookmarkStart w:id="51" w:name="the-field-mapping"/>
     <w:p>
       <w:pPr>
         <w:pStyle w:val="Heading2"/>
@@ -12241,8 +12299,8 @@
         <w:t xml:space="preserve">wrong project is still seen, and R3 can flag it.</w:t>
       </w:r>
     </w:p>
-    <w:bookmarkEnd w:id="49"/>
-    <w:bookmarkStart w:id="50" w:name="normalizing-an-export"/>
+    <w:bookmarkEnd w:id="51"/>
+    <w:bookmarkStart w:id="52" w:name="normalizing-an-export"/>
     <w:p>
       <w:pPr>
         <w:pStyle w:val="Heading2"/>
@@ -12467,8 +12525,8 @@
         <w:t xml:space="preserve">runs the same normalization into a temporary folder and assesses it in one step.</w:t>
       </w:r>
     </w:p>
-    <w:bookmarkEnd w:id="50"/>
-    <w:bookmarkStart w:id="51" w:name="the-capture-configuration"/>
+    <w:bookmarkEnd w:id="52"/>
+    <w:bookmarkStart w:id="53" w:name="the-capture-configuration"/>
     <w:p>
       <w:pPr>
         <w:pStyle w:val="Heading2"/>
@@ -13704,8 +13762,8 @@
         </w:tc>
       </w:tr>
     </w:tbl>
-    <w:bookmarkEnd w:id="51"/>
-    <w:bookmarkStart w:id="52" w:name="tokens-and-least-privilege"/>
+    <w:bookmarkEnd w:id="53"/>
+    <w:bookmarkStart w:id="54" w:name="tokens-and-least-privilege"/>
     <w:p>
       <w:pPr>
         <w:pStyle w:val="Heading2"/>
@@ -14006,8 +14064,8 @@
         <w:t xml:space="preserve">the demonstration pack requires before it accepts a live capture as complete.</w:t>
       </w:r>
     </w:p>
-    <w:bookmarkEnd w:id="52"/>
-    <w:bookmarkStart w:id="53" w:name="how-a-capture-reads"/>
+    <w:bookmarkEnd w:id="54"/>
+    <w:bookmarkStart w:id="55" w:name="how-a-capture-reads"/>
     <w:p>
       <w:pPr>
         <w:pStyle w:val="Heading2"/>
@@ -14437,8 +14495,8 @@
         <w:t xml:space="preserve">is replaced only when the new one succeeds.</w:t>
       </w:r>
     </w:p>
-    <w:bookmarkEnd w:id="53"/>
-    <w:bookmarkStart w:id="54" w:name="rate-limits-and-retries"/>
+    <w:bookmarkEnd w:id="55"/>
+    <w:bookmarkStart w:id="56" w:name="rate-limits-and-retries"/>
     <w:p>
       <w:pPr>
         <w:pStyle w:val="Heading2"/>
@@ -14727,8 +14785,8 @@
         <w:t xml:space="preserve">Connections time out after 10 seconds, and reads after 60. Requests are sequential.</w:t>
       </w:r>
     </w:p>
-    <w:bookmarkEnd w:id="54"/>
-    <w:bookmarkStart w:id="55" w:name="live-verification"/>
+    <w:bookmarkEnd w:id="56"/>
+    <w:bookmarkStart w:id="57" w:name="live-verification"/>
     <w:p>
       <w:pPr>
         <w:pStyle w:val="Heading2"/>
@@ -14875,9 +14933,9 @@
         <w:t xml:space="preserve">lands, the runbook's manual steps apply.</w:t>
       </w:r>
     </w:p>
-    <w:bookmarkEnd w:id="55"/>
-    <w:bookmarkEnd w:id="56"/>
-    <w:bookmarkStart w:id="64" w:name="security-model"/>
+    <w:bookmarkEnd w:id="57"/>
+    <w:bookmarkEnd w:id="58"/>
+    <w:bookmarkStart w:id="66" w:name="security-model"/>
     <w:p>
       <w:pPr>
         <w:pStyle w:val="Heading1"/>
@@ -14895,7 +14953,29 @@
         <w:t xml:space="preserve">Security model</w:t>
       </w:r>
     </w:p>
-    <w:bookmarkStart w:id="57" w:name="read-only-by-construction"/>
+    <w:p>
+      <w:pPr>
+        <w:pStyle w:val="FirstParagraph"/>
+      </w:pPr>
+      <w:r>
+        <w:t xml:space="preserve">To report a vulnerability, follow</w:t>
+      </w:r>
+      <w:r>
+        <w:t xml:space="preserve"> </w:t>
+      </w:r>
+      <w:hyperlink r:id="rId16">
+        <w:r>
+          <w:rPr>
+            <w:rStyle w:val="Hyperlink"/>
+          </w:rPr>
+          <w:t xml:space="preserve">SECURITY.md</w:t>
+        </w:r>
+      </w:hyperlink>
+      <w:r>
+        <w:t xml:space="preserve">: reports are private, never public issues.</w:t>
+      </w:r>
+    </w:p>
+    <w:bookmarkStart w:id="59" w:name="read-only-by-construction"/>
     <w:p>
       <w:pPr>
         <w:pStyle w:val="Heading2"/>
@@ -15022,8 +15102,8 @@
         <w:t xml:space="preserve">Quickbase or to any other source system.</w:t>
       </w:r>
     </w:p>
-    <w:bookmarkEnd w:id="57"/>
-    <w:bookmarkStart w:id="58" w:name="tokens"/>
+    <w:bookmarkEnd w:id="59"/>
+    <w:bookmarkStart w:id="60" w:name="tokens"/>
     <w:p>
       <w:pPr>
         <w:pStyle w:val="Heading2"/>
@@ -15082,8 +15162,8 @@
         <w:t xml:space="preserve">.</w:t>
       </w:r>
     </w:p>
-    <w:bookmarkEnd w:id="58"/>
-    <w:bookmarkStart w:id="59" w:name="input-parsing"/>
+    <w:bookmarkEnd w:id="60"/>
+    <w:bookmarkStart w:id="61" w:name="input-parsing"/>
     <w:p>
       <w:pPr>
         <w:pStyle w:val="Heading2"/>
@@ -15181,8 +15261,8 @@
         <w:t xml:space="preserve">is read with the standard library, with strict UTF-8.</w:t>
       </w:r>
     </w:p>
-    <w:bookmarkEnd w:id="59"/>
-    <w:bookmarkStart w:id="60" w:name="files-and-paths"/>
+    <w:bookmarkEnd w:id="61"/>
+    <w:bookmarkStart w:id="62" w:name="files-and-paths"/>
     <w:p>
       <w:pPr>
         <w:pStyle w:val="Heading2"/>
@@ -15309,8 +15389,8 @@
         <w:t xml:space="preserve">are not hashed. Hashing is streamed in 1 MiB chunks.</w:t>
       </w:r>
     </w:p>
-    <w:bookmarkEnd w:id="60"/>
-    <w:bookmarkStart w:id="61" w:name="the-html-report"/>
+    <w:bookmarkEnd w:id="62"/>
+    <w:bookmarkStart w:id="63" w:name="the-html-report"/>
     <w:p>
       <w:pPr>
         <w:pStyle w:val="Heading2"/>
@@ -15366,8 +15446,8 @@
         <w:t xml:space="preserve">) blocks everything else, even if a page were modified.</w:t>
       </w:r>
     </w:p>
-    <w:bookmarkEnd w:id="61"/>
-    <w:bookmarkStart w:id="62" w:name="outputs"/>
+    <w:bookmarkEnd w:id="63"/>
+    <w:bookmarkStart w:id="64" w:name="outputs"/>
     <w:p>
       <w:pPr>
         <w:pStyle w:val="Heading2"/>
@@ -15526,8 +15606,8 @@
         <w:t xml:space="preserve">If a write fails, the files and folders this run created are removed.</w:t>
       </w:r>
     </w:p>
-    <w:bookmarkEnd w:id="62"/>
-    <w:bookmarkStart w:id="63" w:name="data-handling"/>
+    <w:bookmarkEnd w:id="64"/>
+    <w:bookmarkStart w:id="65" w:name="data-handling"/>
     <w:p>
       <w:pPr>
         <w:pStyle w:val="Heading2"/>
@@ -15595,9 +15675,9 @@
         <w:t xml:space="preserve">replace the realm host name, the app and table IDs, and every user name and email.</w:t>
       </w:r>
     </w:p>
-    <w:bookmarkEnd w:id="63"/>
-    <w:bookmarkEnd w:id="64"/>
-    <w:bookmarkStart w:id="70" w:name="outputs-and-provenance"/>
+    <w:bookmarkEnd w:id="65"/>
+    <w:bookmarkEnd w:id="66"/>
+    <w:bookmarkStart w:id="72" w:name="outputs-and-provenance"/>
     <w:p>
       <w:pPr>
         <w:pStyle w:val="Heading1"/>
@@ -15615,7 +15695,7 @@
         <w:t xml:space="preserve">Outputs and provenance</w:t>
       </w:r>
     </w:p>
-    <w:bookmarkStart w:id="65" w:name="assessmentjson"/>
+    <w:bookmarkStart w:id="67" w:name="assessmentjson"/>
     <w:p>
       <w:pPr>
         <w:pStyle w:val="Heading2"/>
@@ -15659,8 +15739,8 @@
         <w:t xml:space="preserve">system.</w:t>
       </w:r>
     </w:p>
-    <w:bookmarkEnd w:id="65"/>
-    <w:bookmarkStart w:id="66" w:name="run-manifestjson"/>
+    <w:bookmarkEnd w:id="67"/>
+    <w:bookmarkStart w:id="68" w:name="run-manifestjson"/>
     <w:p>
       <w:pPr>
         <w:pStyle w:val="Heading2"/>
@@ -15790,8 +15870,8 @@
         <w:t xml:space="preserve">path, because their temporary folder is removed after the run.</w:t>
       </w:r>
     </w:p>
-    <w:bookmarkEnd w:id="66"/>
-    <w:bookmarkStart w:id="67" w:name="identities-and-determinism"/>
+    <w:bookmarkEnd w:id="68"/>
+    <w:bookmarkStart w:id="69" w:name="identities-and-determinism"/>
     <w:p>
       <w:pPr>
         <w:pStyle w:val="Heading2"/>
@@ -16057,8 +16137,8 @@
         <w:t xml:space="preserve">All digests are SHA-256 over canonical JSON (RFC 8785).</w:t>
       </w:r>
     </w:p>
-    <w:bookmarkEnd w:id="67"/>
-    <w:bookmarkStart w:id="68" w:name="comparisonjson"/>
+    <w:bookmarkEnd w:id="69"/>
+    <w:bookmarkStart w:id="70" w:name="comparisonjson"/>
     <w:p>
       <w:pPr>
         <w:pStyle w:val="Heading2"/>
@@ -16150,8 +16230,8 @@
         <w:t xml:space="preserve">. It exits 20 when anything changed, so it serves as a regression check.</w:t>
       </w:r>
     </w:p>
-    <w:bookmarkEnd w:id="68"/>
-    <w:bookmarkStart w:id="69" w:name="the-sql-export-and-cross-check"/>
+    <w:bookmarkEnd w:id="70"/>
+    <w:bookmarkStart w:id="71" w:name="the-sql-export-and-cross-check"/>
     <w:p>
       <w:pPr>
         <w:pStyle w:val="Heading2"/>
@@ -16495,9 +16575,9 @@
         <w:t xml:space="preserve"> obligations));</w:t>
       </w:r>
     </w:p>
-    <w:bookmarkEnd w:id="69"/>
-    <w:bookmarkEnd w:id="70"/>
-    <w:bookmarkStart w:id="78" w:name="operations"/>
+    <w:bookmarkEnd w:id="71"/>
+    <w:bookmarkEnd w:id="72"/>
+    <w:bookmarkStart w:id="81" w:name="operations"/>
     <w:p>
       <w:pPr>
         <w:pStyle w:val="Heading1"/>
@@ -16515,7 +16595,7 @@
         <w:t xml:space="preserve">Operations</w:t>
       </w:r>
     </w:p>
-    <w:bookmarkStart w:id="71" w:name="command-reference"/>
+    <w:bookmarkStart w:id="73" w:name="command-reference"/>
     <w:p>
       <w:pPr>
         <w:pStyle w:val="Heading2"/>
@@ -17323,8 +17403,8 @@
         </w:tc>
       </w:tr>
     </w:tbl>
-    <w:bookmarkEnd w:id="71"/>
-    <w:bookmarkStart w:id="72" w:name="exit-codes"/>
+    <w:bookmarkEnd w:id="73"/>
+    <w:bookmarkStart w:id="74" w:name="exit-codes"/>
     <w:p>
       <w:pPr>
         <w:pStyle w:val="Heading2"/>
@@ -17616,8 +17696,8 @@
         <w:t xml:space="preserve">its outputs before exiting 10 or 11. Exit code 1 is never used deliberately.</w:t>
       </w:r>
     </w:p>
-    <w:bookmarkEnd w:id="72"/>
-    <w:bookmarkStart w:id="73" w:name="run-error-codes"/>
+    <w:bookmarkEnd w:id="74"/>
+    <w:bookmarkStart w:id="75" w:name="run-error-codes"/>
     <w:p>
       <w:pPr>
         <w:pStyle w:val="Heading2"/>
@@ -20089,8 +20169,8 @@
         </w:tc>
       </w:tr>
     </w:tbl>
-    <w:bookmarkEnd w:id="73"/>
-    <w:bookmarkStart w:id="74" w:name="diagnostics-and---log-json"/>
+    <w:bookmarkEnd w:id="75"/>
+    <w:bookmarkStart w:id="76" w:name="diagnostics-and---log-json"/>
     <w:p>
       <w:pPr>
         <w:pStyle w:val="Heading2"/>
@@ -20306,8 +20386,8 @@
         <w:t xml:space="preserve">member.</w:t>
       </w:r>
     </w:p>
-    <w:bookmarkEnd w:id="74"/>
-    <w:bookmarkStart w:id="75" w:name="automation"/>
+    <w:bookmarkEnd w:id="76"/>
+    <w:bookmarkStart w:id="77" w:name="automation"/>
     <w:p>
       <w:pPr>
         <w:pStyle w:val="Heading2"/>
@@ -20490,8 +20570,8 @@
         <w:t xml:space="preserve">assessment exactly.</w:t>
       </w:r>
     </w:p>
-    <w:bookmarkEnd w:id="75"/>
-    <w:bookmarkStart w:id="76" w:name="X2948c523925ad3e9318ab1e37e1f14be244816b"/>
+    <w:bookmarkEnd w:id="77"/>
+    <w:bookmarkStart w:id="79" w:name="X2948c523925ad3e9318ab1e37e1f14be244816b"/>
     <w:p>
       <w:pPr>
         <w:pStyle w:val="Heading2"/>
@@ -20549,7 +20629,27 @@
         <w:pStyle w:val="BodyText"/>
       </w:pPr>
       <w:r>
-        <w:t xml:space="preserve">The demonstration site publishes the output of</w:t>
+        <w:t xml:space="preserve">The demonstration site,</w:t>
+      </w:r>
+      <w:r>
+        <w:t xml:space="preserve"> </w:t>
+      </w:r>
+      <w:hyperlink r:id="rId78">
+        <w:r>
+          <w:rPr>
+            <w:rStyle w:val="Hyperlink"/>
+          </w:rPr>
+          <w:t xml:space="preserve">bochen2029-pixel.github.io/inspection-reconcile</w:t>
+        </w:r>
+      </w:hyperlink>
+      <w:r>
+        <w:t xml:space="preserve">, publishes</w:t>
+      </w:r>
+      <w:r>
+        <w:t xml:space="preserve"> </w:t>
+      </w:r>
+      <w:r>
+        <w:t xml:space="preserve">the output of</w:t>
       </w:r>
       <w:r>
         <w:t xml:space="preserve"> </w:t>
@@ -20561,17 +20661,38 @@
         <w:t xml:space="preserve">demo --all</w:t>
       </w:r>
       <w:r>
-        <w:t xml:space="preserve">: every scenario's report and the index. It is deployed by</w:t>
-      </w:r>
-      <w:r>
-        <w:t xml:space="preserve"> </w:t>
-      </w:r>
-      <w:r>
-        <w:t xml:space="preserve">a workflow that runs only after CI has passed on a push to the main branch.</w:t>
+        <w:t xml:space="preserve">: every scenario's report and the index. It is deployed by a workflow that runs only after</w:t>
+      </w:r>
+      <w:r>
+        <w:t xml:space="preserve"> </w:t>
+      </w:r>
+      <w:r>
+        <w:t xml:space="preserve">CI has passed on a push to the main branch, and only</w:t>
+      </w:r>
+      <w:r>
+        <w:t xml:space="preserve"> </w:t>
+      </w:r>
+      <w:r>
+        <w:rPr>
+          <w:rStyle w:val="VerbatimChar"/>
+        </w:rPr>
+        <w:t xml:space="preserve">demo --all</w:t>
+      </w:r>
+      <w:r>
+        <w:t xml:space="preserve"> </w:t>
+      </w:r>
+      <w:r>
+        <w:t xml:space="preserve">itself decides what is published: any scenario</w:t>
+      </w:r>
+      <w:r>
+        <w:t xml:space="preserve"> </w:t>
+      </w:r>
+      <w:r>
+        <w:t xml:space="preserve">that departs from its oracle fails the deployment.</w:t>
       </w:r>
     </w:p>
-    <w:bookmarkEnd w:id="76"/>
-    <w:bookmarkStart w:id="77" w:name="Xd80dd4c0588226d84fa18db98b73e338de62feb"/>
+    <w:bookmarkEnd w:id="79"/>
+    <w:bookmarkStart w:id="80" w:name="Xd80dd4c0588226d84fa18db98b73e338de62feb"/>
     <w:p>
       <w:pPr>
         <w:pStyle w:val="Heading2"/>
@@ -20707,9 +20828,9 @@
         <w:t xml:space="preserve">profile.</w:t>
       </w:r>
     </w:p>
-    <w:bookmarkEnd w:id="77"/>
-    <w:bookmarkEnd w:id="78"/>
-    <w:bookmarkStart w:id="82" w:name="limitations-and-verification-status"/>
+    <w:bookmarkEnd w:id="80"/>
+    <w:bookmarkEnd w:id="81"/>
+    <w:bookmarkStart w:id="85" w:name="limitations-and-verification-status"/>
     <w:p>
       <w:pPr>
         <w:pStyle w:val="Heading1"/>
@@ -20727,7 +20848,7 @@
         <w:t xml:space="preserve">Limitations and verification status</w:t>
       </w:r>
     </w:p>
-    <w:bookmarkStart w:id="79" w:name="what-is-verified"/>
+    <w:bookmarkStart w:id="82" w:name="what-is-verified"/>
     <w:p>
       <w:pPr>
         <w:pStyle w:val="Heading2"/>
@@ -20946,8 +21067,8 @@
         </w:tc>
       </w:tr>
     </w:tbl>
-    <w:bookmarkEnd w:id="79"/>
-    <w:bookmarkStart w:id="80" w:name="known-limitations"/>
+    <w:bookmarkEnd w:id="82"/>
+    <w:bookmarkStart w:id="83" w:name="known-limitations"/>
     <w:p>
       <w:pPr>
         <w:pStyle w:val="Heading2"/>
@@ -21153,8 +21274,8 @@
         <w:t xml:space="preserve">The evidence folder is assumed to be a local folder that only the operator controls.</w:t>
       </w:r>
     </w:p>
-    <w:bookmarkEnd w:id="80"/>
-    <w:bookmarkStart w:id="81" w:name="what-is-never-claimed"/>
+    <w:bookmarkEnd w:id="83"/>
+    <w:bookmarkStart w:id="84" w:name="what-is-never-claimed"/>
     <w:p>
       <w:pPr>
         <w:pStyle w:val="Heading2"/>
@@ -21186,8 +21307,8 @@
         <w:t xml:space="preserve">accuracy or labor-saving figure that was not measured.</w:t>
       </w:r>
     </w:p>
-    <w:bookmarkEnd w:id="81"/>
-    <w:bookmarkEnd w:id="82"/>
+    <w:bookmarkEnd w:id="84"/>
+    <w:bookmarkEnd w:id="85"/>
     <w:sectPr>
       <w:footnotePr>
         <w:numRestart w:val="eachSect"/>

</xml_diff>

<commit_message>
T8: the guides cite the published URLs and the --force semantics of AM-10
- Each cover lists the live demo (GitHub Pages) and the project page (opnaorta.ai/inspection-reconcile), and both
  guides link them.
- Administrator Guide:
  - assess and demo with --force delete their previous reports first;
  - normalize and capture-quickbase swap all-or-nothing from a staging folder (SPEC §9.6, AM-10);
  - the reference timings: demo --all in about 5 seconds, S02 (207 findings) in under half a second, measured again
    on this workstation (4.6 s and 0.11 s in-process).
- PDFs and Word documents rebuilt. The private-terms scan of every changed file is clean.

Co-Authored-By: Claude Opus 5.5 <noreply@anthropic.com>
</commit_message>
<xml_diff>
--- a/docs/guide/inspection-reconcile-admin-guide.docx
+++ b/docs/guide/inspection-reconcile-admin-guide.docx
@@ -1297,7 +1297,7 @@
     </w:p>
     <w:bookmarkEnd w:id="25"/>
     <w:bookmarkEnd w:id="26"/>
-    <w:bookmarkStart w:id="33" w:name="installation"/>
+    <w:bookmarkStart w:id="35" w:name="installation"/>
     <w:p>
       <w:pPr>
         <w:pStyle w:val="Heading1"/>
@@ -2066,7 +2066,7 @@
       </w:tr>
     </w:tbl>
     <w:bookmarkEnd w:id="31"/>
-    <w:bookmarkStart w:id="32" w:name="verify-the-installation"/>
+    <w:bookmarkStart w:id="34" w:name="verify-the-installation"/>
     <w:p>
       <w:pPr>
         <w:pStyle w:val="Heading2"/>
@@ -2169,158 +2169,221 @@
         <w:pStyle w:val="FirstParagraph"/>
       </w:pPr>
       <w:r>
-        <w:t xml:space="preserve">With the development extras installed, the full gate is the same one CI runs:</w:t>
+        <w:t xml:space="preserve">On the reference workstation,</w:t>
+      </w:r>
+      <w:r>
+        <w:t xml:space="preserve"> </w:t>
+      </w:r>
+      <w:r>
+        <w:rPr>
+          <w:rStyle w:val="VerbatimChar"/>
+        </w:rPr>
+        <w:t xml:space="preserve">demo --all</w:t>
+      </w:r>
+      <w:r>
+        <w:t xml:space="preserve"> </w:t>
+      </w:r>
+      <w:r>
+        <w:t xml:space="preserve">finishes in about 5 seconds, and a single assessment such as S02, with</w:t>
+      </w:r>
+      <w:r>
+        <w:t xml:space="preserve"> </w:t>
+      </w:r>
+      <w:r>
+        <w:t xml:space="preserve">its 207 findings, in under half a second. The same reports are published at</w:t>
+      </w:r>
+      <w:r>
+        <w:t xml:space="preserve"> </w:t>
+      </w:r>
+      <w:hyperlink r:id="rId32">
+        <w:r>
+          <w:rPr>
+            <w:rStyle w:val="Hyperlink"/>
+          </w:rPr>
+          <w:t xml:space="preserve">bochen2029-pixel.github.io/inspection-reconcile</w:t>
+        </w:r>
+      </w:hyperlink>
+      <w:r>
+        <w:t xml:space="preserve">, and the</w:t>
+      </w:r>
+      <w:r>
+        <w:t xml:space="preserve"> </w:t>
+      </w:r>
+      <w:r>
+        <w:t xml:space="preserve">project page is</w:t>
+      </w:r>
+      <w:r>
+        <w:t xml:space="preserve"> </w:t>
+      </w:r>
+      <w:hyperlink r:id="rId33">
+        <w:r>
+          <w:rPr>
+            <w:rStyle w:val="Hyperlink"/>
+          </w:rPr>
+          <w:t xml:space="preserve">opnaorta.ai/inspection-reconcile</w:t>
+        </w:r>
+      </w:hyperlink>
+      <w:r>
+        <w:t xml:space="preserve">.</w:t>
       </w:r>
     </w:p>
     <w:p>
       <w:pPr>
-        <w:pStyle w:val="SourceCode"/>
-      </w:pPr>
-      <w:r>
-        <w:rPr>
-          <w:rStyle w:val="ExtensionTok"/>
-        </w:rPr>
-        <w:t xml:space="preserve">uv</w:t>
-      </w:r>
-      <w:r>
-        <w:rPr>
-          <w:rStyle w:val="NormalTok"/>
-        </w:rPr>
-        <w:t xml:space="preserve"> run pytest </w:t>
-      </w:r>
-      <w:r>
-        <w:rPr>
-          <w:rStyle w:val="AttributeTok"/>
-        </w:rPr>
-        <w:t xml:space="preserve">-q</w:t>
-      </w:r>
-      <w:r>
-        <w:br/>
-      </w:r>
-      <w:r>
-        <w:rPr>
-          <w:rStyle w:val="ExtensionTok"/>
-        </w:rPr>
-        <w:t xml:space="preserve">uv</w:t>
-      </w:r>
-      <w:r>
-        <w:rPr>
-          <w:rStyle w:val="NormalTok"/>
-        </w:rPr>
-        <w:t xml:space="preserve"> run ruff check . </w:t>
-      </w:r>
-      <w:r>
-        <w:rPr>
-          <w:rStyle w:val="KeywordTok"/>
-        </w:rPr>
-        <w:t xml:space="preserve">&amp;&amp;</w:t>
-      </w:r>
-      <w:r>
-        <w:rPr>
-          <w:rStyle w:val="NormalTok"/>
-        </w:rPr>
-        <w:t xml:space="preserve"> </w:t>
-      </w:r>
-      <w:r>
-        <w:rPr>
-          <w:rStyle w:val="ExtensionTok"/>
-        </w:rPr>
-        <w:t xml:space="preserve">uv</w:t>
-      </w:r>
-      <w:r>
-        <w:rPr>
-          <w:rStyle w:val="NormalTok"/>
-        </w:rPr>
-        <w:t xml:space="preserve"> run ruff format </w:t>
-      </w:r>
-      <w:r>
-        <w:rPr>
-          <w:rStyle w:val="AttributeTok"/>
-        </w:rPr>
-        <w:t xml:space="preserve">--check</w:t>
-      </w:r>
-      <w:r>
-        <w:rPr>
-          <w:rStyle w:val="NormalTok"/>
-        </w:rPr>
-        <w:t xml:space="preserve"> .</w:t>
-      </w:r>
-      <w:r>
-        <w:br/>
-      </w:r>
-      <w:r>
-        <w:rPr>
-          <w:rStyle w:val="ExtensionTok"/>
-        </w:rPr>
-        <w:t xml:space="preserve">uv</w:t>
-      </w:r>
-      <w:r>
-        <w:rPr>
-          <w:rStyle w:val="NormalTok"/>
-        </w:rPr>
-        <w:t xml:space="preserve"> run mypy</w:t>
-      </w:r>
-    </w:p>
-    <w:bookmarkEnd w:id="32"/>
-    <w:bookmarkEnd w:id="33"/>
-    <w:bookmarkStart w:id="41" w:name="the-requirement-pack"/>
-    <w:p>
-      <w:pPr>
-        <w:pStyle w:val="Heading1"/>
-      </w:pPr>
-      <w:r>
-        <w:rPr>
-          <w:rStyle w:val="SectionNumber"/>
-        </w:rPr>
-        <w:t xml:space="preserve">4</w:t>
-      </w:r>
-      <w:r>
-        <w:tab/>
-      </w:r>
-      <w:r>
-        <w:t xml:space="preserve">The requirement pack</w:t>
-      </w:r>
-    </w:p>
-    <w:bookmarkStart w:id="34" w:name="format"/>
-    <w:p>
-      <w:pPr>
-        <w:pStyle w:val="Heading2"/>
-      </w:pPr>
-      <w:r>
-        <w:rPr>
-          <w:rStyle w:val="SectionNumber"/>
-        </w:rPr>
-        <w:t xml:space="preserve">4.1</w:t>
-      </w:r>
-      <w:r>
-        <w:tab/>
-      </w:r>
-      <w:r>
-        <w:t xml:space="preserve">Format</w:t>
+        <w:pStyle w:val="BodyText"/>
+      </w:pPr>
+      <w:r>
+        <w:t xml:space="preserve">With the development extras installed, the full gate is the same one CI runs:</w:t>
       </w:r>
     </w:p>
     <w:p>
       <w:pPr>
-        <w:pStyle w:val="FirstParagraph"/>
-      </w:pPr>
-      <w:r>
-        <w:t xml:space="preserve">A requirement pack is a YAML file that states what a project's documentation must contain. The demonstration pack,</w:t>
-      </w:r>
-      <w:r>
-        <w:t xml:space="preserve"> </w:t>
-      </w:r>
-      <w:r>
-        <w:rPr>
-          <w:rStyle w:val="VerbatimChar"/>
-        </w:rPr>
-        <w:t xml:space="preserve">policies/north-creek-demo.yml</w:t>
-      </w:r>
-      <w:r>
-        <w:t xml:space="preserve">:</w:t>
+        <w:pStyle w:val="SourceCode"/>
+      </w:pPr>
+      <w:r>
+        <w:rPr>
+          <w:rStyle w:val="ExtensionTok"/>
+        </w:rPr>
+        <w:t xml:space="preserve">uv</w:t>
+      </w:r>
+      <w:r>
+        <w:rPr>
+          <w:rStyle w:val="NormalTok"/>
+        </w:rPr>
+        <w:t xml:space="preserve"> run pytest </w:t>
+      </w:r>
+      <w:r>
+        <w:rPr>
+          <w:rStyle w:val="AttributeTok"/>
+        </w:rPr>
+        <w:t xml:space="preserve">-q</w:t>
+      </w:r>
+      <w:r>
+        <w:br/>
+      </w:r>
+      <w:r>
+        <w:rPr>
+          <w:rStyle w:val="ExtensionTok"/>
+        </w:rPr>
+        <w:t xml:space="preserve">uv</w:t>
+      </w:r>
+      <w:r>
+        <w:rPr>
+          <w:rStyle w:val="NormalTok"/>
+        </w:rPr>
+        <w:t xml:space="preserve"> run ruff check . </w:t>
+      </w:r>
+      <w:r>
+        <w:rPr>
+          <w:rStyle w:val="KeywordTok"/>
+        </w:rPr>
+        <w:t xml:space="preserve">&amp;&amp;</w:t>
+      </w:r>
+      <w:r>
+        <w:rPr>
+          <w:rStyle w:val="NormalTok"/>
+        </w:rPr>
+        <w:t xml:space="preserve"> </w:t>
+      </w:r>
+      <w:r>
+        <w:rPr>
+          <w:rStyle w:val="ExtensionTok"/>
+        </w:rPr>
+        <w:t xml:space="preserve">uv</w:t>
+      </w:r>
+      <w:r>
+        <w:rPr>
+          <w:rStyle w:val="NormalTok"/>
+        </w:rPr>
+        <w:t xml:space="preserve"> run ruff format </w:t>
+      </w:r>
+      <w:r>
+        <w:rPr>
+          <w:rStyle w:val="AttributeTok"/>
+        </w:rPr>
+        <w:t xml:space="preserve">--check</w:t>
+      </w:r>
+      <w:r>
+        <w:rPr>
+          <w:rStyle w:val="NormalTok"/>
+        </w:rPr>
+        <w:t xml:space="preserve"> .</w:t>
+      </w:r>
+      <w:r>
+        <w:br/>
+      </w:r>
+      <w:r>
+        <w:rPr>
+          <w:rStyle w:val="ExtensionTok"/>
+        </w:rPr>
+        <w:t xml:space="preserve">uv</w:t>
+      </w:r>
+      <w:r>
+        <w:rPr>
+          <w:rStyle w:val="NormalTok"/>
+        </w:rPr>
+        <w:t xml:space="preserve"> run mypy</w:t>
+      </w:r>
+    </w:p>
+    <w:bookmarkEnd w:id="34"/>
+    <w:bookmarkEnd w:id="35"/>
+    <w:bookmarkStart w:id="43" w:name="the-requirement-pack"/>
+    <w:p>
+      <w:pPr>
+        <w:pStyle w:val="Heading1"/>
+      </w:pPr>
+      <w:r>
+        <w:rPr>
+          <w:rStyle w:val="SectionNumber"/>
+        </w:rPr>
+        <w:t xml:space="preserve">4</w:t>
+      </w:r>
+      <w:r>
+        <w:tab/>
+      </w:r>
+      <w:r>
+        <w:t xml:space="preserve">The requirement pack</w:t>
+      </w:r>
+    </w:p>
+    <w:bookmarkStart w:id="36" w:name="format"/>
+    <w:p>
+      <w:pPr>
+        <w:pStyle w:val="Heading2"/>
+      </w:pPr>
+      <w:r>
+        <w:rPr>
+          <w:rStyle w:val="SectionNumber"/>
+        </w:rPr>
+        <w:t xml:space="preserve">4.1</w:t>
+      </w:r>
+      <w:r>
+        <w:tab/>
+      </w:r>
+      <w:r>
+        <w:t xml:space="preserve">Format</w:t>
       </w:r>
     </w:p>
     <w:p>
       <w:pPr>
+        <w:pStyle w:val="FirstParagraph"/>
+      </w:pPr>
+      <w:r>
+        <w:t xml:space="preserve">A requirement pack is a YAML file that states what a project's documentation must contain. The demonstration pack,</w:t>
+      </w:r>
+      <w:r>
+        <w:t xml:space="preserve"> </w:t>
+      </w:r>
+      <w:r>
+        <w:rPr>
+          <w:rStyle w:val="VerbatimChar"/>
+        </w:rPr>
+        <w:t xml:space="preserve">policies/north-creek-demo.yml</w:t>
+      </w:r>
+      <w:r>
+        <w:t xml:space="preserve">:</w:t>
+      </w:r>
+    </w:p>
+    <w:p>
+      <w:pPr>
         <w:pStyle w:val="SourceCode"/>
       </w:pPr>
       <w:r>
@@ -3758,8 +3821,8 @@
         <w:t xml:space="preserve">}</w:t>
       </w:r>
     </w:p>
-    <w:bookmarkEnd w:id="34"/>
-    <w:bookmarkStart w:id="35" w:name="field-by-field"/>
+    <w:bookmarkEnd w:id="36"/>
+    <w:bookmarkStart w:id="37" w:name="field-by-field"/>
     <w:p>
       <w:pPr>
         <w:pStyle w:val="Heading2"/>
@@ -4417,8 +4480,8 @@
         <w:t xml:space="preserve">Every member is required, and an unknown member at any level is a run error.</w:t>
       </w:r>
     </w:p>
-    <w:bookmarkEnd w:id="35"/>
-    <w:bookmarkStart w:id="36" w:name="versioning-and-effective_from"/>
+    <w:bookmarkEnd w:id="37"/>
+    <w:bookmarkStart w:id="38" w:name="versioning-and-effective_from"/>
     <w:p>
       <w:pPr>
         <w:pStyle w:val="Heading2"/>
@@ -4525,8 +4588,8 @@
         <w:t xml:space="preserve">computed over the parsed content, so comments and formatting do not change it.</w:t>
       </w:r>
     </w:p>
-    <w:bookmarkEnd w:id="36"/>
-    <w:bookmarkStart w:id="37" w:name="accepted-coverage-bases"/>
+    <w:bookmarkEnd w:id="38"/>
+    <w:bookmarkStart w:id="39" w:name="accepted-coverage-bases"/>
     <w:p>
       <w:pPr>
         <w:pStyle w:val="Heading2"/>
@@ -4734,8 +4797,8 @@
         <w:t xml:space="preserve">failures. Do it only deliberately, and record why.</w:t>
       </w:r>
     </w:p>
-    <w:bookmarkEnd w:id="37"/>
-    <w:bookmarkStart w:id="38" w:name="approval-binding-digest-or-revisions"/>
+    <w:bookmarkEnd w:id="39"/>
+    <w:bookmarkStart w:id="40" w:name="approval-binding-digest-or-revisions"/>
     <w:p>
       <w:pPr>
         <w:pStyle w:val="Heading2"/>
@@ -4865,8 +4928,8 @@
         <w:t xml:space="preserve">command prints the digest a review process should store with its decision.</w:t>
       </w:r>
     </w:p>
-    <w:bookmarkEnd w:id="38"/>
-    <w:bookmarkStart w:id="39" w:name="safe-yaml"/>
+    <w:bookmarkEnd w:id="40"/>
+    <w:bookmarkStart w:id="41" w:name="safe-yaml"/>
     <w:p>
       <w:pPr>
         <w:pStyle w:val="Heading2"/>
@@ -4997,8 +5060,8 @@
         <w:t xml:space="preserve">expecting an integer rejects them instead of silently reading another number.</w:t>
       </w:r>
     </w:p>
-    <w:bookmarkEnd w:id="39"/>
-    <w:bookmarkStart w:id="40" w:name="writing-a-pack-for-a-real-project"/>
+    <w:bookmarkEnd w:id="41"/>
+    <w:bookmarkStart w:id="42" w:name="writing-a-pack-for-a-real-project"/>
     <w:p>
       <w:pPr>
         <w:pStyle w:val="Heading2"/>
@@ -5036,9 +5099,9 @@
         <w:t xml:space="preserve">requirements. Application configuration cannot establish business intent.</w:t>
       </w:r>
     </w:p>
-    <w:bookmarkEnd w:id="40"/>
-    <w:bookmarkEnd w:id="41"/>
-    <w:bookmarkStart w:id="49" w:name="the-canonical-snapshot"/>
+    <w:bookmarkEnd w:id="42"/>
+    <w:bookmarkEnd w:id="43"/>
+    <w:bookmarkStart w:id="51" w:name="the-canonical-snapshot"/>
     <w:p>
       <w:pPr>
         <w:pStyle w:val="Heading1"/>
@@ -5079,7 +5142,7 @@
         <w:t xml:space="preserve">write it.</w:t>
       </w:r>
     </w:p>
-    <w:bookmarkStart w:id="42" w:name="directory-layout"/>
+    <w:bookmarkStart w:id="44" w:name="directory-layout"/>
     <w:p>
       <w:pPr>
         <w:pStyle w:val="Heading2"/>
@@ -5212,8 +5275,8 @@
         <w:t xml:space="preserve">). The evidence root must be a real folder, not a link or junction.</w:t>
       </w:r>
     </w:p>
-    <w:bookmarkEnd w:id="42"/>
-    <w:bookmarkStart w:id="43" w:name="manifestjson"/>
+    <w:bookmarkEnd w:id="44"/>
+    <w:bookmarkStart w:id="45" w:name="manifestjson"/>
     <w:p>
       <w:pPr>
         <w:pStyle w:val="Heading2"/>
@@ -7227,8 +7290,8 @@
         </w:tc>
       </w:tr>
     </w:tbl>
-    <w:bookmarkEnd w:id="43"/>
-    <w:bookmarkStart w:id="44" w:name="projectjson"/>
+    <w:bookmarkEnd w:id="45"/>
+    <w:bookmarkStart w:id="46" w:name="projectjson"/>
     <w:p>
       <w:pPr>
         <w:pStyle w:val="Heading2"/>
@@ -7418,8 +7481,8 @@
         <w:t xml:space="preserve">must equal the pack's.</w:t>
       </w:r>
     </w:p>
-    <w:bookmarkEnd w:id="44"/>
-    <w:bookmarkStart w:id="45" w:name="csv-rules"/>
+    <w:bookmarkEnd w:id="46"/>
+    <w:bookmarkStart w:id="47" w:name="csv-rules"/>
     <w:p>
       <w:pPr>
         <w:pStyle w:val="Heading2"/>
@@ -7612,8 +7675,8 @@
         <w:t xml:space="preserve">.</w:t>
       </w:r>
     </w:p>
-    <w:bookmarkEnd w:id="45"/>
-    <w:bookmarkStart w:id="46" w:name="columns"/>
+    <w:bookmarkEnd w:id="47"/>
+    <w:bookmarkStart w:id="48" w:name="columns"/>
     <w:p>
       <w:pPr>
         <w:pStyle w:val="Heading2"/>
@@ -9411,8 +9474,8 @@
         <w:t xml:space="preserve">that the approval covers one artifact revision.</w:t>
       </w:r>
     </w:p>
-    <w:bookmarkEnd w:id="46"/>
-    <w:bookmarkStart w:id="47" w:name="value-grammars"/>
+    <w:bookmarkEnd w:id="48"/>
+    <w:bookmarkStart w:id="49" w:name="value-grammars"/>
     <w:p>
       <w:pPr>
         <w:pStyle w:val="Heading2"/>
@@ -9869,8 +9932,8 @@
         <w:t xml:space="preserve">quarantined. A path that breaks the PATH rules is never opened.</w:t>
       </w:r>
     </w:p>
-    <w:bookmarkEnd w:id="47"/>
-    <w:bookmarkStart w:id="48" w:name="coverage-claims-and-basis-tokens"/>
+    <w:bookmarkEnd w:id="49"/>
+    <w:bookmarkStart w:id="50" w:name="coverage-claims-and-basis-tokens"/>
     <w:p>
       <w:pPr>
         <w:pStyle w:val="Heading2"/>
@@ -10186,9 +10249,9 @@
         <w:t xml:space="preserve">one the dataset does not contain.</w:t>
       </w:r>
     </w:p>
-    <w:bookmarkEnd w:id="48"/>
-    <w:bookmarkEnd w:id="49"/>
-    <w:bookmarkStart w:id="58" w:name="quickbase"/>
+    <w:bookmarkEnd w:id="50"/>
+    <w:bookmarkEnd w:id="51"/>
+    <w:bookmarkStart w:id="60" w:name="quickbase"/>
     <w:p>
       <w:pPr>
         <w:pStyle w:val="Heading1"/>
@@ -10206,7 +10269,7 @@
         <w:t xml:space="preserve">Quickbase</w:t>
       </w:r>
     </w:p>
-    <w:bookmarkStart w:id="50" w:name="what-the-adapter-does"/>
+    <w:bookmarkStart w:id="52" w:name="what-the-adapter-does"/>
     <w:p>
       <w:pPr>
         <w:pStyle w:val="Heading2"/>
@@ -10385,8 +10448,8 @@
         <w:t xml:space="preserve">.</w:t>
       </w:r>
     </w:p>
-    <w:bookmarkEnd w:id="50"/>
-    <w:bookmarkStart w:id="51" w:name="the-field-mapping"/>
+    <w:bookmarkEnd w:id="52"/>
+    <w:bookmarkStart w:id="53" w:name="the-field-mapping"/>
     <w:p>
       <w:pPr>
         <w:pStyle w:val="Heading2"/>
@@ -12299,8 +12362,8 @@
         <w:t xml:space="preserve">wrong project is still seen, and R3 can flag it.</w:t>
       </w:r>
     </w:p>
-    <w:bookmarkEnd w:id="51"/>
-    <w:bookmarkStart w:id="52" w:name="normalizing-an-export"/>
+    <w:bookmarkEnd w:id="53"/>
+    <w:bookmarkStart w:id="54" w:name="normalizing-an-export"/>
     <w:p>
       <w:pPr>
         <w:pStyle w:val="Heading2"/>
@@ -12525,8 +12588,8 @@
         <w:t xml:space="preserve">runs the same normalization into a temporary folder and assesses it in one step.</w:t>
       </w:r>
     </w:p>
-    <w:bookmarkEnd w:id="52"/>
-    <w:bookmarkStart w:id="53" w:name="the-capture-configuration"/>
+    <w:bookmarkEnd w:id="54"/>
+    <w:bookmarkStart w:id="55" w:name="the-capture-configuration"/>
     <w:p>
       <w:pPr>
         <w:pStyle w:val="Heading2"/>
@@ -13762,8 +13825,8 @@
         </w:tc>
       </w:tr>
     </w:tbl>
-    <w:bookmarkEnd w:id="53"/>
-    <w:bookmarkStart w:id="54" w:name="tokens-and-least-privilege"/>
+    <w:bookmarkEnd w:id="55"/>
+    <w:bookmarkStart w:id="56" w:name="tokens-and-least-privilege"/>
     <w:p>
       <w:pPr>
         <w:pStyle w:val="Heading2"/>
@@ -14064,8 +14127,8 @@
         <w:t xml:space="preserve">the demonstration pack requires before it accepts a live capture as complete.</w:t>
       </w:r>
     </w:p>
-    <w:bookmarkEnd w:id="54"/>
-    <w:bookmarkStart w:id="55" w:name="how-a-capture-reads"/>
+    <w:bookmarkEnd w:id="56"/>
+    <w:bookmarkStart w:id="57" w:name="how-a-capture-reads"/>
     <w:p>
       <w:pPr>
         <w:pStyle w:val="Heading2"/>
@@ -14495,8 +14558,8 @@
         <w:t xml:space="preserve">is replaced only when the new one succeeds.</w:t>
       </w:r>
     </w:p>
-    <w:bookmarkEnd w:id="55"/>
-    <w:bookmarkStart w:id="56" w:name="rate-limits-and-retries"/>
+    <w:bookmarkEnd w:id="57"/>
+    <w:bookmarkStart w:id="58" w:name="rate-limits-and-retries"/>
     <w:p>
       <w:pPr>
         <w:pStyle w:val="Heading2"/>
@@ -14785,8 +14848,8 @@
         <w:t xml:space="preserve">Connections time out after 10 seconds, and reads after 60. Requests are sequential.</w:t>
       </w:r>
     </w:p>
-    <w:bookmarkEnd w:id="56"/>
-    <w:bookmarkStart w:id="57" w:name="live-verification"/>
+    <w:bookmarkEnd w:id="58"/>
+    <w:bookmarkStart w:id="59" w:name="live-verification"/>
     <w:p>
       <w:pPr>
         <w:pStyle w:val="Heading2"/>
@@ -14933,9 +14996,9 @@
         <w:t xml:space="preserve">lands, the runbook's manual steps apply.</w:t>
       </w:r>
     </w:p>
-    <w:bookmarkEnd w:id="57"/>
-    <w:bookmarkEnd w:id="58"/>
-    <w:bookmarkStart w:id="66" w:name="security-model"/>
+    <w:bookmarkEnd w:id="59"/>
+    <w:bookmarkEnd w:id="60"/>
+    <w:bookmarkStart w:id="68" w:name="security-model"/>
     <w:p>
       <w:pPr>
         <w:pStyle w:val="Heading1"/>
@@ -14975,7 +15038,7 @@
         <w:t xml:space="preserve">: reports are private, never public issues.</w:t>
       </w:r>
     </w:p>
-    <w:bookmarkStart w:id="59" w:name="read-only-by-construction"/>
+    <w:bookmarkStart w:id="61" w:name="read-only-by-construction"/>
     <w:p>
       <w:pPr>
         <w:pStyle w:val="Heading2"/>
@@ -15102,8 +15165,8 @@
         <w:t xml:space="preserve">Quickbase or to any other source system.</w:t>
       </w:r>
     </w:p>
-    <w:bookmarkEnd w:id="59"/>
-    <w:bookmarkStart w:id="60" w:name="tokens"/>
+    <w:bookmarkEnd w:id="61"/>
+    <w:bookmarkStart w:id="62" w:name="tokens"/>
     <w:p>
       <w:pPr>
         <w:pStyle w:val="Heading2"/>
@@ -15162,8 +15225,8 @@
         <w:t xml:space="preserve">.</w:t>
       </w:r>
     </w:p>
-    <w:bookmarkEnd w:id="60"/>
-    <w:bookmarkStart w:id="61" w:name="input-parsing"/>
+    <w:bookmarkEnd w:id="62"/>
+    <w:bookmarkStart w:id="63" w:name="input-parsing"/>
     <w:p>
       <w:pPr>
         <w:pStyle w:val="Heading2"/>
@@ -15261,8 +15324,8 @@
         <w:t xml:space="preserve">is read with the standard library, with strict UTF-8.</w:t>
       </w:r>
     </w:p>
-    <w:bookmarkEnd w:id="61"/>
-    <w:bookmarkStart w:id="62" w:name="files-and-paths"/>
+    <w:bookmarkEnd w:id="63"/>
+    <w:bookmarkStart w:id="64" w:name="files-and-paths"/>
     <w:p>
       <w:pPr>
         <w:pStyle w:val="Heading2"/>
@@ -15389,8 +15452,8 @@
         <w:t xml:space="preserve">are not hashed. Hashing is streamed in 1 MiB chunks.</w:t>
       </w:r>
     </w:p>
-    <w:bookmarkEnd w:id="62"/>
-    <w:bookmarkStart w:id="63" w:name="the-html-report"/>
+    <w:bookmarkEnd w:id="64"/>
+    <w:bookmarkStart w:id="65" w:name="the-html-report"/>
     <w:p>
       <w:pPr>
         <w:pStyle w:val="Heading2"/>
@@ -15446,8 +15509,8 @@
         <w:t xml:space="preserve">) blocks everything else, even if a page were modified.</w:t>
       </w:r>
     </w:p>
-    <w:bookmarkEnd w:id="63"/>
-    <w:bookmarkStart w:id="64" w:name="outputs"/>
+    <w:bookmarkEnd w:id="65"/>
+    <w:bookmarkStart w:id="66" w:name="outputs"/>
     <w:p>
       <w:pPr>
         <w:pStyle w:val="Heading2"/>
@@ -15525,7 +15588,7 @@
         <w:t xml:space="preserve"> </w:t>
       </w:r>
       <w:r>
-        <w:t xml:space="preserve">replaced:</w:t>
+        <w:t xml:space="preserve">replaced.</w:t>
       </w:r>
       <w:r>
         <w:t xml:space="preserve"> </w:t>
@@ -15555,7 +15618,7 @@
         <w:t xml:space="preserve"> </w:t>
       </w:r>
       <w:r>
-        <w:t xml:space="preserve">replace their reports, and</w:t>
+        <w:t xml:space="preserve">delete their previous reports and write the new ones.</w:t>
       </w:r>
       <w:r>
         <w:t xml:space="preserve"> </w:t>
@@ -15585,13 +15648,28 @@
         <w:t xml:space="preserve"> </w:t>
       </w:r>
       <w:r>
-        <w:t xml:space="preserve">replace a previous</w:t>
-      </w:r>
-      <w:r>
-        <w:t xml:space="preserve"> </w:t>
-      </w:r>
-      <w:r>
-        <w:t xml:space="preserve">output of their own.</w:t>
+        <w:t xml:space="preserve">build the new output in a staging folder inside</w:t>
+      </w:r>
+      <w:r>
+        <w:t xml:space="preserve"> </w:t>
+      </w:r>
+      <w:r>
+        <w:rPr>
+          <w:rStyle w:val="VerbatimChar"/>
+        </w:rPr>
+        <w:t xml:space="preserve">--out</w:t>
+      </w:r>
+      <w:r>
+        <w:t xml:space="preserve"> </w:t>
+      </w:r>
+      <w:r>
+        <w:t xml:space="preserve">and swap it in all-or-nothing, only</w:t>
+      </w:r>
+      <w:r>
+        <w:t xml:space="preserve"> </w:t>
+      </w:r>
+      <w:r>
+        <w:t xml:space="preserve">after the run succeeded, so a failed run leaves the previous output exactly as it was.</w:t>
       </w:r>
     </w:p>
     <w:p>
@@ -15606,8 +15684,8 @@
         <w:t xml:space="preserve">If a write fails, the files and folders this run created are removed.</w:t>
       </w:r>
     </w:p>
-    <w:bookmarkEnd w:id="64"/>
-    <w:bookmarkStart w:id="65" w:name="data-handling"/>
+    <w:bookmarkEnd w:id="66"/>
+    <w:bookmarkStart w:id="67" w:name="data-handling"/>
     <w:p>
       <w:pPr>
         <w:pStyle w:val="Heading2"/>
@@ -15675,9 +15753,9 @@
         <w:t xml:space="preserve">replace the realm host name, the app and table IDs, and every user name and email.</w:t>
       </w:r>
     </w:p>
-    <w:bookmarkEnd w:id="65"/>
-    <w:bookmarkEnd w:id="66"/>
-    <w:bookmarkStart w:id="72" w:name="outputs-and-provenance"/>
+    <w:bookmarkEnd w:id="67"/>
+    <w:bookmarkEnd w:id="68"/>
+    <w:bookmarkStart w:id="74" w:name="outputs-and-provenance"/>
     <w:p>
       <w:pPr>
         <w:pStyle w:val="Heading1"/>
@@ -15695,7 +15773,7 @@
         <w:t xml:space="preserve">Outputs and provenance</w:t>
       </w:r>
     </w:p>
-    <w:bookmarkStart w:id="67" w:name="assessmentjson"/>
+    <w:bookmarkStart w:id="69" w:name="assessmentjson"/>
     <w:p>
       <w:pPr>
         <w:pStyle w:val="Heading2"/>
@@ -15739,8 +15817,8 @@
         <w:t xml:space="preserve">system.</w:t>
       </w:r>
     </w:p>
-    <w:bookmarkEnd w:id="67"/>
-    <w:bookmarkStart w:id="68" w:name="run-manifestjson"/>
+    <w:bookmarkEnd w:id="69"/>
+    <w:bookmarkStart w:id="70" w:name="run-manifestjson"/>
     <w:p>
       <w:pPr>
         <w:pStyle w:val="Heading2"/>
@@ -15870,8 +15948,8 @@
         <w:t xml:space="preserve">path, because their temporary folder is removed after the run.</w:t>
       </w:r>
     </w:p>
-    <w:bookmarkEnd w:id="68"/>
-    <w:bookmarkStart w:id="69" w:name="identities-and-determinism"/>
+    <w:bookmarkEnd w:id="70"/>
+    <w:bookmarkStart w:id="71" w:name="identities-and-determinism"/>
     <w:p>
       <w:pPr>
         <w:pStyle w:val="Heading2"/>
@@ -16137,8 +16215,8 @@
         <w:t xml:space="preserve">All digests are SHA-256 over canonical JSON (RFC 8785).</w:t>
       </w:r>
     </w:p>
-    <w:bookmarkEnd w:id="69"/>
-    <w:bookmarkStart w:id="70" w:name="comparisonjson"/>
+    <w:bookmarkEnd w:id="71"/>
+    <w:bookmarkStart w:id="72" w:name="comparisonjson"/>
     <w:p>
       <w:pPr>
         <w:pStyle w:val="Heading2"/>
@@ -16230,8 +16308,8 @@
         <w:t xml:space="preserve">. It exits 20 when anything changed, so it serves as a regression check.</w:t>
       </w:r>
     </w:p>
-    <w:bookmarkEnd w:id="70"/>
-    <w:bookmarkStart w:id="71" w:name="the-sql-export-and-cross-check"/>
+    <w:bookmarkEnd w:id="72"/>
+    <w:bookmarkStart w:id="73" w:name="the-sql-export-and-cross-check"/>
     <w:p>
       <w:pPr>
         <w:pStyle w:val="Heading2"/>
@@ -16575,9 +16653,9 @@
         <w:t xml:space="preserve"> obligations));</w:t>
       </w:r>
     </w:p>
-    <w:bookmarkEnd w:id="71"/>
-    <w:bookmarkEnd w:id="72"/>
-    <w:bookmarkStart w:id="81" w:name="operations"/>
+    <w:bookmarkEnd w:id="73"/>
+    <w:bookmarkEnd w:id="74"/>
+    <w:bookmarkStart w:id="82" w:name="operations"/>
     <w:p>
       <w:pPr>
         <w:pStyle w:val="Heading1"/>
@@ -16595,7 +16673,7 @@
         <w:t xml:space="preserve">Operations</w:t>
       </w:r>
     </w:p>
-    <w:bookmarkStart w:id="73" w:name="command-reference"/>
+    <w:bookmarkStart w:id="75" w:name="command-reference"/>
     <w:p>
       <w:pPr>
         <w:pStyle w:val="Heading2"/>
@@ -17403,8 +17481,8 @@
         </w:tc>
       </w:tr>
     </w:tbl>
-    <w:bookmarkEnd w:id="73"/>
-    <w:bookmarkStart w:id="74" w:name="exit-codes"/>
+    <w:bookmarkEnd w:id="75"/>
+    <w:bookmarkStart w:id="76" w:name="exit-codes"/>
     <w:p>
       <w:pPr>
         <w:pStyle w:val="Heading2"/>
@@ -17696,8 +17774,8 @@
         <w:t xml:space="preserve">its outputs before exiting 10 or 11. Exit code 1 is never used deliberately.</w:t>
       </w:r>
     </w:p>
-    <w:bookmarkEnd w:id="74"/>
-    <w:bookmarkStart w:id="75" w:name="run-error-codes"/>
+    <w:bookmarkEnd w:id="76"/>
+    <w:bookmarkStart w:id="77" w:name="run-error-codes"/>
     <w:p>
       <w:pPr>
         <w:pStyle w:val="Heading2"/>
@@ -20169,8 +20247,8 @@
         </w:tc>
       </w:tr>
     </w:tbl>
-    <w:bookmarkEnd w:id="75"/>
-    <w:bookmarkStart w:id="76" w:name="diagnostics-and---log-json"/>
+    <w:bookmarkEnd w:id="77"/>
+    <w:bookmarkStart w:id="78" w:name="diagnostics-and---log-json"/>
     <w:p>
       <w:pPr>
         <w:pStyle w:val="Heading2"/>
@@ -20386,8 +20464,8 @@
         <w:t xml:space="preserve">member.</w:t>
       </w:r>
     </w:p>
-    <w:bookmarkEnd w:id="76"/>
-    <w:bookmarkStart w:id="77" w:name="automation"/>
+    <w:bookmarkEnd w:id="78"/>
+    <w:bookmarkStart w:id="79" w:name="automation"/>
     <w:p>
       <w:pPr>
         <w:pStyle w:val="Heading2"/>
@@ -20570,8 +20648,8 @@
         <w:t xml:space="preserve">assessment exactly.</w:t>
       </w:r>
     </w:p>
-    <w:bookmarkEnd w:id="77"/>
-    <w:bookmarkStart w:id="79" w:name="X2948c523925ad3e9318ab1e37e1f14be244816b"/>
+    <w:bookmarkEnd w:id="79"/>
+    <w:bookmarkStart w:id="80" w:name="X2948c523925ad3e9318ab1e37e1f14be244816b"/>
     <w:p>
       <w:pPr>
         <w:pStyle w:val="Heading2"/>
@@ -20634,7 +20712,7 @@
       <w:r>
         <w:t xml:space="preserve"> </w:t>
       </w:r>
-      <w:hyperlink r:id="rId78">
+      <w:hyperlink r:id="rId32">
         <w:r>
           <w:rPr>
             <w:rStyle w:val="Hyperlink"/>
@@ -20691,8 +20769,8 @@
         <w:t xml:space="preserve">that departs from its oracle fails the deployment.</w:t>
       </w:r>
     </w:p>
-    <w:bookmarkEnd w:id="79"/>
-    <w:bookmarkStart w:id="80" w:name="Xd80dd4c0588226d84fa18db98b73e338de62feb"/>
+    <w:bookmarkEnd w:id="80"/>
+    <w:bookmarkStart w:id="81" w:name="Xd80dd4c0588226d84fa18db98b73e338de62feb"/>
     <w:p>
       <w:pPr>
         <w:pStyle w:val="Heading2"/>
@@ -20828,9 +20906,9 @@
         <w:t xml:space="preserve">profile.</w:t>
       </w:r>
     </w:p>
-    <w:bookmarkEnd w:id="80"/>
     <w:bookmarkEnd w:id="81"/>
-    <w:bookmarkStart w:id="85" w:name="limitations-and-verification-status"/>
+    <w:bookmarkEnd w:id="82"/>
+    <w:bookmarkStart w:id="86" w:name="limitations-and-verification-status"/>
     <w:p>
       <w:pPr>
         <w:pStyle w:val="Heading1"/>
@@ -20848,7 +20926,7 @@
         <w:t xml:space="preserve">Limitations and verification status</w:t>
       </w:r>
     </w:p>
-    <w:bookmarkStart w:id="82" w:name="what-is-verified"/>
+    <w:bookmarkStart w:id="83" w:name="what-is-verified"/>
     <w:p>
       <w:pPr>
         <w:pStyle w:val="Heading2"/>
@@ -21067,8 +21145,8 @@
         </w:tc>
       </w:tr>
     </w:tbl>
-    <w:bookmarkEnd w:id="82"/>
-    <w:bookmarkStart w:id="83" w:name="known-limitations"/>
+    <w:bookmarkEnd w:id="83"/>
+    <w:bookmarkStart w:id="84" w:name="known-limitations"/>
     <w:p>
       <w:pPr>
         <w:pStyle w:val="Heading2"/>
@@ -21274,8 +21352,8 @@
         <w:t xml:space="preserve">The evidence folder is assumed to be a local folder that only the operator controls.</w:t>
       </w:r>
     </w:p>
-    <w:bookmarkEnd w:id="83"/>
-    <w:bookmarkStart w:id="84" w:name="what-is-never-claimed"/>
+    <w:bookmarkEnd w:id="84"/>
+    <w:bookmarkStart w:id="85" w:name="what-is-never-claimed"/>
     <w:p>
       <w:pPr>
         <w:pStyle w:val="Heading2"/>
@@ -21307,8 +21385,8 @@
         <w:t xml:space="preserve">accuracy or labor-saving figure that was not measured.</w:t>
       </w:r>
     </w:p>
-    <w:bookmarkEnd w:id="84"/>
     <w:bookmarkEnd w:id="85"/>
+    <w:bookmarkEnd w:id="86"/>
     <w:sectPr>
       <w:footnotePr>
         <w:numRestart w:val="eachSect"/>

</xml_diff>

<commit_message>
docs: AM-11 and D-017 for the Appendix D builder; the runbook fast path
- SPEC §22.17 (AM-11): the create-only builder, its bounds, the three
  differences from Appendix D the API forces, and what its tests prove (a
  fake realm, not Quickbase). Appendix D points to it. docs/SPEC.md is synced
  from the master.
- decisions.md D-017.
- c3-runbook.md: the fast path. The token stays in QB_USER_TOKEN, which
  capture-quickbase also reads, as step 5 requires.
- README, SECURITY.md, CHANGELOG (Unreleased), status.md: the one writer,
  outside the package.
- Admin guide 6.8: the builder replaces the "in development" note; the PDF
  and Word files are rebuilt (32 pages).

Co-Authored-By: Claude Opus 5.5 <noreply@anthropic.com>
</commit_message>
<xml_diff>
--- a/docs/guide/inspection-reconcile-admin-guide.docx
+++ b/docs/guide/inspection-reconcile-admin-guide.docx
@@ -1106,7 +1106,7 @@
               <w:pStyle w:val="Compact"/>
             </w:pPr>
             <w:r>
-              <w:t xml:space="preserve">the fixture generator, the screenshot tool and the guide builder</w:t>
+              <w:t xml:space="preserve">the fixture generator, the screenshot tool, the guide builder and the Appendix D test-app builder</w:t>
             </w:r>
           </w:p>
         </w:tc>
@@ -14956,6 +14956,118 @@
     </w:p>
     <w:p>
       <w:pPr>
+        <w:pStyle w:val="BodyText"/>
+      </w:pPr>
+      <w:r>
+        <w:t xml:space="preserve">The runbook's fast path replaces the first two steps with one command, using a token for your own user.</w:t>
+      </w:r>
+      <w:r>
+        <w:t xml:space="preserve"> </w:t>
+      </w:r>
+      <w:r>
+        <w:rPr>
+          <w:rStyle w:val="VerbatimChar"/>
+        </w:rPr>
+        <w:t xml:space="preserve">tools/qb_build_test_app.py</w:t>
+      </w:r>
+      <w:r>
+        <w:t xml:space="preserve"> </w:t>
+      </w:r>
+      <w:r>
+        <w:t xml:space="preserve">creates the app, its tables, fields and relationships, and the S01 records with their</w:t>
+      </w:r>
+      <w:r>
+        <w:t xml:space="preserve"> </w:t>
+      </w:r>
+      <w:r>
+        <w:t xml:space="preserve">80 files. It then writes</w:t>
+      </w:r>
+      <w:r>
+        <w:t xml:space="preserve"> </w:t>
+      </w:r>
+      <w:r>
+        <w:rPr>
+          <w:rStyle w:val="VerbatimChar"/>
+        </w:rPr>
+        <w:t xml:space="preserve">local/quickbase-live.yml</w:t>
+      </w:r>
+      <w:r>
+        <w:t xml:space="preserve"> </w:t>
+      </w:r>
+      <w:r>
+        <w:t xml:space="preserve">and</w:t>
+      </w:r>
+      <w:r>
+        <w:t xml:space="preserve"> </w:t>
+      </w:r>
+      <w:r>
+        <w:rPr>
+          <w:rStyle w:val="VerbatimChar"/>
+        </w:rPr>
+        <w:t xml:space="preserve">local/qb-capture.yml</w:t>
+      </w:r>
+      <w:r>
+        <w:t xml:space="preserve">. The least-privilege role of step 3</w:t>
+      </w:r>
+      <w:r>
+        <w:t xml:space="preserve"> </w:t>
+      </w:r>
+      <w:r>
+        <w:t xml:space="preserve">stays a manual choice. Without</w:t>
+      </w:r>
+      <w:r>
+        <w:t xml:space="preserve"> </w:t>
+      </w:r>
+      <w:r>
+        <w:rPr>
+          <w:rStyle w:val="VerbatimChar"/>
+        </w:rPr>
+        <w:t xml:space="preserve">--yes</w:t>
+      </w:r>
+      <w:r>
+        <w:t xml:space="preserve">, the builder prints the plan and sends nothing:</w:t>
+      </w:r>
+    </w:p>
+    <w:p>
+      <w:pPr>
+        <w:pStyle w:val="SourceCode"/>
+      </w:pPr>
+      <w:r>
+        <w:rPr>
+          <w:rStyle w:val="CommentTok"/>
+        </w:rPr>
+        <w:t xml:space="preserve"># the plan only: nothing is sent until you add --yes</w:t>
+      </w:r>
+      <w:r>
+        <w:br/>
+      </w:r>
+      <w:r>
+        <w:rPr>
+          <w:rStyle w:val="ExtensionTok"/>
+        </w:rPr>
+        <w:t xml:space="preserve">uv</w:t>
+      </w:r>
+      <w:r>
+        <w:rPr>
+          <w:rStyle w:val="NormalTok"/>
+        </w:rPr>
+        <w:t xml:space="preserve"> run python tools/qb_build_test_app.py </w:t>
+      </w:r>
+      <w:r>
+        <w:rPr>
+          <w:rStyle w:val="AttributeTok"/>
+        </w:rPr>
+        <w:t xml:space="preserve">--realm</w:t>
+      </w:r>
+      <w:r>
+        <w:rPr>
+          <w:rStyle w:val="NormalTok"/>
+        </w:rPr>
+        <w:t xml:space="preserve"> example.quickbase.com</w:t>
+      </w:r>
+    </w:p>
+    <w:p>
+      <w:pPr>
         <w:pStyle w:val="BlockText"/>
       </w:pPr>
       <w:r>
@@ -14969,31 +15081,31 @@
         <w:t xml:space="preserve"> </w:t>
       </w:r>
       <w:r>
-        <w:t xml:space="preserve">A tool that builds the Appendix D test app through the Quickbase API is in development. It will be the only code in</w:t>
-      </w:r>
-      <w:r>
-        <w:t xml:space="preserve"> </w:t>
-      </w:r>
-      <w:r>
-        <w:t xml:space="preserve">the repository that writes to Quickbase, and it will live in</w:t>
-      </w:r>
-      <w:r>
-        <w:t xml:space="preserve"> </w:t>
-      </w:r>
-      <w:r>
-        <w:rPr>
-          <w:rStyle w:val="VerbatimChar"/>
-        </w:rPr>
-        <w:t xml:space="preserve">tools/</w:t>
-      </w:r>
-      <w:r>
-        <w:t xml:space="preserve">, separate from the read-only package. Until it</w:t>
-      </w:r>
-      <w:r>
-        <w:t xml:space="preserve"> </w:t>
-      </w:r>
-      <w:r>
-        <w:t xml:space="preserve">lands, the runbook's manual steps apply.</w:t>
+        <w:t xml:space="preserve">The builder is the only code in the repository that writes to Quickbase, and the package never imports it. Its</w:t>
+      </w:r>
+      <w:r>
+        <w:t xml:space="preserve"> </w:t>
+      </w:r>
+      <w:r>
+        <w:t xml:space="preserve">client allows six create and read operations, and refuses before any I/O every id that did not come from a</w:t>
+      </w:r>
+      <w:r>
+        <w:t xml:space="preserve"> </w:t>
+      </w:r>
+      <w:r>
+        <w:t xml:space="preserve">response in the same run. So it only creates, and only inside the app it has just created. A failed write is</w:t>
+      </w:r>
+      <w:r>
+        <w:t xml:space="preserve"> </w:t>
+      </w:r>
+      <w:r>
+        <w:t xml:space="preserve">never repeated. If a build stops part way, the message names the app for you to delete, because the tool never</w:t>
+      </w:r>
+      <w:r>
+        <w:t xml:space="preserve"> </w:t>
+      </w:r>
+      <w:r>
+        <w:t xml:space="preserve">deletes anything (SPEC §22.17).</w:t>
       </w:r>
     </w:p>
     <w:bookmarkEnd w:id="59"/>

</xml_diff>

<commit_message>
Admin guide §6.8: the builder's ledger refuses outside ids; its client refuses an updating upsert
From blk6aqof's pre-deploy check of the project page. The note credited the
client with the provenance refusal, but the call sites' ledger does it. It
also now names the four id kinds, which leaves room for the optional
--decided-by-id user id. The PDF and Word files are rebuilt (32 pages).

Co-Authored-By: Claude Opus 5.5 <noreply@anthropic.com>
</commit_message>
<xml_diff>
--- a/docs/guide/inspection-reconcile-admin-guide.docx
+++ b/docs/guide/inspection-reconcile-admin-guide.docx
@@ -15081,31 +15081,31 @@
         <w:t xml:space="preserve"> </w:t>
       </w:r>
       <w:r>
-        <w:t xml:space="preserve">The builder is the only code in the repository that writes to Quickbase, and the package never imports it. Its</w:t>
-      </w:r>
-      <w:r>
-        <w:t xml:space="preserve"> </w:t>
-      </w:r>
-      <w:r>
-        <w:t xml:space="preserve">client allows six create and read operations, and refuses before any I/O every id that did not come from a</w:t>
-      </w:r>
-      <w:r>
-        <w:t xml:space="preserve"> </w:t>
-      </w:r>
-      <w:r>
-        <w:t xml:space="preserve">response in the same run. So it only creates, and only inside the app it has just created. A failed write is</w:t>
-      </w:r>
-      <w:r>
-        <w:t xml:space="preserve"> </w:t>
-      </w:r>
-      <w:r>
-        <w:t xml:space="preserve">never repeated. If a build stops part way, the message names the app for you to delete, because the tool never</w:t>
-      </w:r>
-      <w:r>
-        <w:t xml:space="preserve"> </w:t>
-      </w:r>
-      <w:r>
-        <w:t xml:space="preserve">deletes anything (SPEC §22.17).</w:t>
+        <w:t xml:space="preserve">The builder is the only code in the repository that writes to Quickbase, and the package never imports it. It</w:t>
+      </w:r>
+      <w:r>
+        <w:t xml:space="preserve"> </w:t>
+      </w:r>
+      <w:r>
+        <w:t xml:space="preserve">allows six create and read operations. Before any I/O, it refuses every app, table, field and record id that did</w:t>
+      </w:r>
+      <w:r>
+        <w:t xml:space="preserve"> </w:t>
+      </w:r>
+      <w:r>
+        <w:t xml:space="preserve">not come from a response in the same run, and its client refuses any upsert that could update a record. So it</w:t>
+      </w:r>
+      <w:r>
+        <w:t xml:space="preserve"> </w:t>
+      </w:r>
+      <w:r>
+        <w:t xml:space="preserve">only creates, and only inside the app it has just created. A failed write is never repeated. If a build stops</w:t>
+      </w:r>
+      <w:r>
+        <w:t xml:space="preserve"> </w:t>
+      </w:r>
+      <w:r>
+        <w:t xml:space="preserve">part way, the message names the app for you to delete, because the tool never deletes anything (SPEC §22.17).</w:t>
       </w:r>
     </w:p>
     <w:bookmarkEnd w:id="59"/>

</xml_diff>

<commit_message>
docs: the Quickbase extra is needed by the builder too; export-sqlite example writes under out/
From uylmncsh's fresh-clone GO on fc2b8b9 (G2). After the admin guide's
minimal `uv sync`, the runbook's fast path died with a traceback, because
httpx comes only with the quickbase extra. 4816721 makes the builder say
what to install, and this commit documents it:
- the runbook asks for `uv sync --extra quickbase` before either path;
  capture-quickbase in step 7 needs it too;
- the admin guide's table lists the builder under the quickbase extra
  (PDF and Word rebuilt, 32 pages);
- the README's export-sqlite example writes out/snapshot.sqlite (gitignored)
  instead of leaving a file in the repository root.

Co-Authored-By: Claude Opus 5.5 <noreply@anthropic.com>
</commit_message>
<xml_diff>
--- a/docs/guide/inspection-reconcile-admin-guide.docx
+++ b/docs/guide/inspection-reconcile-admin-guide.docx
@@ -2022,6 +2022,18 @@
                 <w:rStyle w:val="VerbatimChar"/>
               </w:rPr>
               <w:t xml:space="preserve">capture-quickbase</w:t>
+            </w:r>
+            <w:r>
+              <w:t xml:space="preserve">, and the test-app builder</w:t>
+            </w:r>
+            <w:r>
+              <w:t xml:space="preserve"> </w:t>
+            </w:r>
+            <w:r>
+              <w:rPr>
+                <w:rStyle w:val="VerbatimChar"/>
+              </w:rPr>
+              <w:t xml:space="preserve">tools/qb_build_test_app.py</w:t>
             </w:r>
           </w:p>
         </w:tc>

</xml_diff>